<commit_message>
Add defendant name to document templates and provide a field list for suggestions
Update system template placeholders and implement a browse fields panel for document generation.

Replit-Commit-Author: Agent
Replit-Commit-Session-Id: db7477e2-0ef1-4832-8ce0-bebf8dc94aef
Replit-Commit-Checkpoint-Type: full_checkpoint
Replit-Commit-Event-Id: 6faded69-8409-4a3f-b925-112120159634
Replit-Commit-Screenshot-Url: https://storage.googleapis.com/screenshot-production-us-central1/9c1aa8dc-61c8-4dff-8db7-28e28c4ad897/db7477e2-0ef1-4832-8ce0-bebf8dc94aef/5PulXjy
Replit-Helium-Checkpoint-Created: true
</commit_message>
<xml_diff>
--- a/server/system-templates/case-signature.docx
+++ b/server/system-templates/case-signature.docx
@@ -30,7 +30,7 @@
           <w:szCs w:val="24"/>
           <w:u w:val="single"/>
         </w:rPr>
-        <w:t>{{SIGNATURE}}</w:t>
+        <w:t>&lt;&lt;SIGNATURE&gt;&gt;</w:t>
       </w:r>
       <w:r>
         <w:rPr>
@@ -61,7 +61,7 @@
           <w:sz w:val="24"/>
           <w:szCs w:val="24"/>
         </w:rPr>
-        <w:t>{{ATTORNEY_NAME}}</w:t>
+        <w:t>&lt;&lt;ATTORNEY_NAME&gt;&gt;</w:t>
       </w:r>
       <w:r>
         <w:rPr>
@@ -79,7 +79,7 @@
           <w:sz w:val="24"/>
           <w:szCs w:val="24"/>
         </w:rPr>
-        <w:t>{{ATTORNEY_CODE}}</w:t>
+        <w:t>&lt;&lt;ATTORNEY_CODE&gt;&gt;</w:t>
       </w:r>
       <w:r>
         <w:rPr>
@@ -119,7 +119,7 @@
           <w:sz w:val="24"/>
           <w:szCs w:val="24"/>
         </w:rPr>
-        <w:t>{{CLIENT_TYPE}}</w:t>
+        <w:t>&lt;&lt;CLIENT_TYPE&gt;&gt;</w:t>
       </w:r>
     </w:p>
     <w:p>
@@ -139,7 +139,23 @@
           <w:spacing w:val="-3"/>
           <w:sz w:val="24"/>
         </w:rPr>
-        <w:t>{{CLIENT_NAME}}</w:t>
+        <w:t>&lt;&lt;</w:t>
+      </w:r>
+      <w:r>
+        <w:rPr>
+          <w:rFonts w:ascii="Times New Roman" w:hAnsi="Times New Roman"/>
+          <w:spacing w:val="-3"/>
+          <w:sz w:val="24"/>
+        </w:rPr>
+        <w:t>DEFENDANT</w:t>
+      </w:r>
+      <w:r>
+        <w:rPr>
+          <w:rFonts w:ascii="Times New Roman" w:hAnsi="Times New Roman"/>
+          <w:spacing w:val="-3"/>
+          <w:sz w:val="24"/>
+        </w:rPr>
+        <w:t>_NAME&gt;&gt;</w:t>
       </w:r>
     </w:p>
     <w:p>
@@ -213,7 +229,7 @@
           <w:sz w:val="24"/>
           <w:szCs w:val="24"/>
         </w:rPr>
-        <w:t>{{ATTORNEY_FIRM}}</w:t>
+        <w:t>&lt;&lt;ATTORNEY_FIRM&gt;&gt;</w:t>
       </w:r>
     </w:p>
     <w:p>
@@ -237,7 +253,7 @@
           <w:sz w:val="24"/>
           <w:szCs w:val="24"/>
         </w:rPr>
-        <w:t>{{ATTORNEY_ADDRESS}}</w:t>
+        <w:t>&lt;&lt;ATTORNEY_ADDRESS&gt;&gt;</w:t>
       </w:r>
     </w:p>
     <w:p>
@@ -281,7 +297,7 @@
           <w:sz w:val="24"/>
           <w:szCs w:val="24"/>
         </w:rPr>
-        <w:t>{{ATTORNEY_PHONE}}</w:t>
+        <w:t>&lt;&lt;ATTORNEY_PHONE&gt;&gt;</w:t>
       </w:r>
     </w:p>
     <w:p>
@@ -317,7 +333,7 @@
           <w:szCs w:val="24"/>
         </w:rPr>
         <w:tab/>
-        <w:t>{{ATTORNEY_EMAIL}}</w:t>
+        <w:t>&lt;&lt;ATTORNEY_EMAIL&gt;&gt;</w:t>
       </w:r>
       <w:r>
         <w:rPr>

</xml_diff>